<commit_message>
fix(contest): strictly align speech topics with Attachment 2 full text and cartoon/anime wording
</commit_message>
<xml_diff>
--- a/115校內語文競賽/四年丙班_各項目培訓資料庫/06_國語演說組/學生_在校教學練習每日學習單與自評表.docx
+++ b/115校內語文競賽/四年丙班_各項目培訓資料庫/06_國語演說組/學生_在校教學練習每日學習單與自評表.docx
@@ -7655,7 +7655,7 @@
           <w:color w:val="1E293B"/>
           <w:sz w:val="20"/>
         </w:rPr>
-        <w:t>【題目二示範講稿】我最喜歡的卡通人物</w:t>
+        <w:t>【題目二示範講稿】我最喜歡的卡通(動漫)人物</w:t>
       </w:r>
     </w:p>
     <w:p>
@@ -7667,7 +7667,7 @@
           <w:color w:val="1E293B"/>
           <w:sz w:val="20"/>
         </w:rPr>
-        <w:t>尊敬的評判老師、各位同學，大家好！我是四年丙班第○號選手。今天我所要演說的題目是——〈我最喜歡的卡通人物〉。</w:t>
+        <w:t>尊敬的評判老師、各位同學，大家好！我是四年丙班第○號選手。今天我所要演說的題目是——〈我最喜歡的卡通(動漫)人物〉。</w:t>
       </w:r>
     </w:p>
     <w:p>
@@ -7679,7 +7679,7 @@
           <w:color w:val="1E293B"/>
           <w:sz w:val="20"/>
         </w:rPr>
-        <w:t xml:space="preserve">　　「每個人心裡都有一位英雄，指引我們勇敢向前。」如果有人問我最喜歡哪一個卡通人物，我會毫不猶豫地回答——「哆啦A夢」！</w:t>
+        <w:t xml:space="preserve">　　「每個人心裡都有一位英雄，指引我們勇敢向前。」如果有人問我最喜歡哪一個卡通或動漫人物，我會毫不猶豫地回答——「哆啦A夢」！</w:t>
       </w:r>
     </w:p>
     <w:p>
@@ -7759,7 +7759,7 @@
           <w:color w:val="475569"/>
           <w:sz w:val="18"/>
         </w:rPr>
-        <w:t>★ 學習要領：選題確認：［ ］題目一：〈如果同學做了不對的事〉  ［ ］題目二：〈我最喜歡的卡通人物〉</w:t>
+        <w:t>★ 學習要領：選題確認：［ ］題目一：〈如果同學做了不對的事〉  ［ ］題目二：〈我最喜歡的卡通(動漫)人物〉</w:t>
         <w:br/>
         <w:t>★ 核心靈魂：一句話說出你的演說核心（我的演說是想告訴大家……）</w:t>
       </w:r>

</xml_diff>